<commit_message>
Rewrite report in simpler language for first-year level
Co-Authored-By: Claude Sonnet 5.5 <noreply@anthropic.com>
Claude-Session: https://claude.ai/code/session_015p17wgSwMYCgMhCTC5Wcyn
</commit_message>
<xml_diff>
--- a/report.docx
+++ b/report.docx
@@ -43,7 +43,7 @@
           <w:sz w:val="32"/>
           <w:szCs w:val="32"/>
         </w:rPr>
-        <w:t xml:space="preserve">親密なパートナーからの暴力への曝露と子どもの喘息・アレルギー:既存研究の整理</w:t>
+        <w:t xml:space="preserve">家庭内の暴力と子どもの喘息・アレルギーの関係:既存の研究を整理する</w:t>
       </w:r>
     </w:p>
     <w:p>
@@ -160,7 +160,7 @@
           <w:sz w:val="28"/>
           <w:szCs w:val="28"/>
         </w:rPr>
-        <w:t xml:space="preserve">親密なパートナーからの暴力への曝露と子どもの喘息・アレルギー:既存研究の整理</w:t>
+        <w:t xml:space="preserve">家庭内の暴力と子どもの喘息・アレルギーの関係:既存の研究を整理する</w:t>
       </w:r>
     </w:p>
     <w:p>
@@ -191,7 +191,7 @@
           <w:sz w:val="21"/>
           <w:szCs w:val="21"/>
         </w:rPr>
-        <w:t xml:space="preserve">家庭内で暴力が起きている環境で育つことは、子どもの心に影響を与えると広く知られている。</w:t>
+        <w:t xml:space="preserve">家の中で暴力が起きていると、子どもの心に悪い影響が出ることはよく知られている。</w:t>
       </w:r>
       <w:r>
         <w:rPr>
@@ -209,37 +209,37 @@
           <w:sz w:val="21"/>
           <w:szCs w:val="21"/>
         </w:rPr>
-        <w:t xml:space="preserve">しかし、その影響は心の問題にとどまらず、喘息などの身体の病気とも関連している可能性が、近年の疫学研究で指摘されている。</w:t>
-      </w:r>
-    </w:p>
-    <w:p>
-      <w:pPr>
-        <w:spacing w:after="0" w:line="360"/>
-        <w:ind w:firstLine="210"/>
-        <w:jc w:val="both"/>
-      </w:pPr>
-      <w:r>
-        <w:rPr>
-          <w:rFonts w:ascii="Times New Roman" w:eastAsia="MS Mincho" w:hAnsi="Times New Roman"/>
-          <w:sz w:val="21"/>
-          <w:szCs w:val="21"/>
-        </w:rPr>
-        <w:t xml:space="preserve">そこで本レポートは、次の問いを立てる。第一に、家庭内の暴力、特にパートナーからの暴力にさらされることは、子どもの喘息やアレルギー疾患と関連するのか。第二に、関連があるとすれば、どのような仕組みが考えられているのか。第三に、現在の研究では何が分かっていて、何が分かっていないのか。</w:t>
-      </w:r>
-    </w:p>
-    <w:p>
-      <w:pPr>
-        <w:spacing w:after="0" w:line="360"/>
-        <w:ind w:firstLine="210"/>
-        <w:jc w:val="both"/>
-      </w:pPr>
-      <w:r>
-        <w:rPr>
-          <w:rFonts w:ascii="Times New Roman" w:eastAsia="MS Mincho" w:hAnsi="Times New Roman"/>
-          <w:sz w:val="21"/>
-          <w:szCs w:val="21"/>
-        </w:rPr>
-        <w:t xml:space="preserve">本レポートでは、英語で発表された疫学研究とレビュー論文5本を読み、これらの問いに沿って整理する。ただし、本レポートで扱う研究の多くは観察研究であり、暴力が病気の原因であると断定するものではない。また、</w:t>
+        <w:t xml:space="preserve">ところが近年の研究では、暴力の影響は心だけでなく、喘息などの体の病気とも関係があるかもしれないと言われ始めている。</w:t>
+      </w:r>
+    </w:p>
+    <w:p>
+      <w:pPr>
+        <w:spacing w:after="0" w:line="360"/>
+        <w:ind w:firstLine="210"/>
+        <w:jc w:val="both"/>
+      </w:pPr>
+      <w:r>
+        <w:rPr>
+          <w:rFonts w:ascii="Times New Roman" w:eastAsia="MS Mincho" w:hAnsi="Times New Roman"/>
+          <w:sz w:val="21"/>
+          <w:szCs w:val="21"/>
+        </w:rPr>
+        <w:t xml:space="preserve">そこで本レポートでは、次の3つの問いを立てる。1つ目は、パートナーからの暴力がある家庭で育つことは、子どもの喘息やアレルギーと関係があるのかという問いである。2つ目は、関係があるとしたら、どのような理由が考えられているのかという問いである。3つ目は、今の研究で何が分かっていて、何がまだ分かっていないのかという問いである。</w:t>
+      </w:r>
+    </w:p>
+    <w:p>
+      <w:pPr>
+        <w:spacing w:after="0" w:line="360"/>
+        <w:ind w:firstLine="210"/>
+        <w:jc w:val="both"/>
+      </w:pPr>
+      <w:r>
+        <w:rPr>
+          <w:rFonts w:ascii="Times New Roman" w:eastAsia="MS Mincho" w:hAnsi="Times New Roman"/>
+          <w:sz w:val="21"/>
+          <w:szCs w:val="21"/>
+        </w:rPr>
+        <w:t xml:space="preserve">これらの問いに答えるために、英語で書かれた研究論文とレビュー論文(いくつもの研究をまとめた論文)の合計5本を読み、内容を整理する。ただし、読んだ研究のほとんどは「観察研究」である。観察研究とは、人を実際に調べて関係を探る研究のことで、暴力が病気の原因だとまでは言い切れない。また、</w:t>
       </w:r>
       <w:r>
         <w:rPr>
@@ -249,7 +249,7 @@
           <w:highlight w:val="yellow"/>
           <w:highlightCs w:val="yellow"/>
         </w:rPr>
-        <w:t xml:space="preserve">【父親の暴力に限定した研究が見つからなかった点も、考察で取り上げる。】</w:t>
+        <w:t xml:space="preserve">【父親の暴力だけを調べた研究が見つからなかったことも、考察で取り上げる。】</w:t>
       </w:r>
     </w:p>
     <w:p>
@@ -290,7 +290,7 @@
           <w:sz w:val="21"/>
           <w:szCs w:val="21"/>
         </w:rPr>
-        <w:t xml:space="preserve"> とは、配偶者や恋人など親密な関係にある相手からの、身体的・心理的・性的な暴力を指す。日本語では「ドメスティック・バイオレンス(DV)」と呼ばれることが多い。</w:t>
+        <w:t xml:space="preserve"> とは、夫や恋人など、親しい関係にある相手から受ける暴力のことである。身体への暴力だけでなく、心を傷つける言動や性的な暴力も含まれる。日本では「ドメスティック・バイオレンス(DV)」という言い方が一般的である。</w:t>
       </w:r>
       <w:r>
         <w:rPr>
@@ -325,22 +325,22 @@
           <w:sz w:val="21"/>
           <w:szCs w:val="21"/>
         </w:rPr>
-        <w:t xml:space="preserve"> とは、アレルギー体質と関わる病気の総称で、本レポートでは喘息、アトピー性皮膚炎、アレルギー性鼻結膜炎を指す。</w:t>
-      </w:r>
-    </w:p>
-    <w:p>
-      <w:pPr>
-        <w:spacing w:after="0" w:line="360"/>
-        <w:ind w:firstLine="210"/>
-        <w:jc w:val="both"/>
-      </w:pPr>
-      <w:r>
-        <w:rPr>
-          <w:rFonts w:ascii="Times New Roman" w:eastAsia="MS Mincho" w:hAnsi="Times New Roman"/>
-          <w:sz w:val="21"/>
-          <w:szCs w:val="21"/>
-        </w:rPr>
-        <w:t xml:space="preserve">なお、本レポートが扱う研究の多くは、母親が自分の被害を報告したデータを用いている(Suglia ら, 2010 など)。そのため、子どもが暴力を直接目撃したかどうかや、加害者が父親であるかどうかは、研究ごとに扱いが異なる点に注意が必要である。</w:t>
+        <w:t xml:space="preserve"> とは、アレルギーの体質と関係のある病気をまとめた呼び方である。本レポートでは、喘息、アトピー性皮膚炎(湿疹)、アレルギー性鼻結膜炎(花粉症のような症状)を指す。</w:t>
+      </w:r>
+    </w:p>
+    <w:p>
+      <w:pPr>
+        <w:spacing w:after="0" w:line="360"/>
+        <w:ind w:firstLine="210"/>
+        <w:jc w:val="both"/>
+      </w:pPr>
+      <w:r>
+        <w:rPr>
+          <w:rFonts w:ascii="Times New Roman" w:eastAsia="MS Mincho" w:hAnsi="Times New Roman"/>
+          <w:sz w:val="21"/>
+          <w:szCs w:val="21"/>
+        </w:rPr>
+        <w:t xml:space="preserve">また、読んだ研究の多くは、母親が自分の受けた暴力について答えたデータを使っている(Suglia ら, 2010 など)。そのため、子どもが暴力を直接見たかどうかや、暴力をふるったのが父親かどうかは、研究によって扱いが違う。この点に注意して読む必要がある。</w:t>
       </w:r>
     </w:p>
     <w:p>
@@ -371,7 +371,7 @@
           <w:sz w:val="21"/>
           <w:szCs w:val="21"/>
         </w:rPr>
-        <w:t xml:space="preserve">先行研究を、調べている対象ごとに4つに分けて整理する。</w:t>
+        <w:t xml:space="preserve">先行研究を、何を調べたかによって4つに分けて整理する。なお、「〜倍」という数字は、ある条件の人が、そうでない人と比べてどれくらい病気になりやすかったかを表している。</w:t>
       </w:r>
     </w:p>
     <w:p>
@@ -387,22 +387,22 @@
           <w:sz w:val="21"/>
           <w:szCs w:val="21"/>
         </w:rPr>
-        <w:t xml:space="preserve">3.1 母親のIPVと子どもの喘息</w:t>
-      </w:r>
-    </w:p>
-    <w:p>
-      <w:pPr>
-        <w:spacing w:after="0" w:line="360"/>
-        <w:ind w:firstLine="210"/>
-        <w:jc w:val="both"/>
-      </w:pPr>
-      <w:r>
-        <w:rPr>
-          <w:rFonts w:ascii="Times New Roman" w:eastAsia="MS Mincho" w:hAnsi="Times New Roman"/>
-          <w:sz w:val="21"/>
-          <w:szCs w:val="21"/>
-        </w:rPr>
-        <w:t xml:space="preserve">最も本レポートの問いに近いのは、米国の出生コホート研究を用いた Suglia ら(2010)である。この研究は、2,013人の子どもについて、母親が子の父親または現在のパートナーから受けた暴力を、出産後、12か月、36か月に尋ねている。その結果、母親が慢性的に暴力を受けていた子どもは、そうでない子どもに比べて、3歳までに医師から喘息と診断されるオッズが1.8倍であった(95%信頼区間 1.0–3.5)。ただし信頼区間の下限は1.0であり、関連の強さには幅がある。また、住環境の乱れも喘息と関連しており(オッズ比1.5)、住環境が悪い家庭ほど暴力の影響が大きい傾向があった。</w:t>
+        <w:t xml:space="preserve">3.1 母親が受けた暴力と子どもの喘息</w:t>
+      </w:r>
+    </w:p>
+    <w:p>
+      <w:pPr>
+        <w:spacing w:after="0" w:line="360"/>
+        <w:ind w:firstLine="210"/>
+        <w:jc w:val="both"/>
+      </w:pPr>
+      <w:r>
+        <w:rPr>
+          <w:rFonts w:ascii="Times New Roman" w:eastAsia="MS Mincho" w:hAnsi="Times New Roman"/>
+          <w:sz w:val="21"/>
+          <w:szCs w:val="21"/>
+        </w:rPr>
+        <w:t xml:space="preserve">本レポートの問いにいちばん近いのは、アメリカの Suglia ら(2010)の研究である。この研究では、2,013人の子どもについて、母親が子どもの父親や今のパートナーから暴力を受けていないかを、出産後、1歳、3歳のときに尋ねた。その結果、母親が長く暴力を受けていた子どもは、そうでない子どもに比べて、3歳までに医師から喘息と診断された割合が約1.8倍であった。ただし、この結果には誤差の幅があり、関係の強さは「約1.0倍から3.5倍」の間とも考えられる。つまり、あまり強い結論とは言えない。また、この研究では、家の中が散らかっていたり、混み合っていたりすることも喘息と関係していた。住環境が悪い家庭ほど、暴力の影響が大きい傾向もあった。</w:t>
       </w:r>
       <w:r>
         <w:rPr>
@@ -412,22 +412,22 @@
           <w:highlight w:val="yellow"/>
           <w:highlightCs w:val="yellow"/>
         </w:rPr>
-        <w:t xml:space="preserve">【この「ストレスが重なるとリスクが高まる」という点を、自分の言葉で一文まとめる。】</w:t>
-      </w:r>
-    </w:p>
-    <w:p>
-      <w:pPr>
-        <w:spacing w:after="0" w:line="360"/>
-        <w:ind w:firstLine="210"/>
-        <w:jc w:val="both"/>
-      </w:pPr>
-      <w:r>
-        <w:rPr>
-          <w:rFonts w:ascii="Times New Roman" w:eastAsia="MS Mincho" w:hAnsi="Times New Roman"/>
-          <w:sz w:val="21"/>
-          <w:szCs w:val="21"/>
-        </w:rPr>
-        <w:t xml:space="preserve">Bair-Merritt ら(2015)は、米国の低所得家庭1,292組を追跡し、子どもが7か月の時点での母親のIPVが、その後の喘息の報告を予測することを示した。さらに、ストレスを受けたときにコルチゾール(ストレスホルモン)が上がりやすい子どもでだけ、この関連が有意であった。</w:t>
+        <w:t xml:space="preserve">【「悪いことが重なるとリスクが上がる」という点を、自分の言葉で一文にまとめる。】</w:t>
+      </w:r>
+    </w:p>
+    <w:p>
+      <w:pPr>
+        <w:spacing w:after="0" w:line="360"/>
+        <w:ind w:firstLine="210"/>
+        <w:jc w:val="both"/>
+      </w:pPr>
+      <w:r>
+        <w:rPr>
+          <w:rFonts w:ascii="Times New Roman" w:eastAsia="MS Mincho" w:hAnsi="Times New Roman"/>
+          <w:sz w:val="21"/>
+          <w:szCs w:val="21"/>
+        </w:rPr>
+        <w:t xml:space="preserve">Bair-Merritt ら(2015)は、アメリカの低所得家庭1,292組を追いかけて調べた。その結果、子どもが生後7か月のときの母親の被害が、その後の子どもの喘息の報告につながっていた。さらに、ストレスを受けたときにストレスホルモン(コルチゾール)が増えやすい子どもでだけ、この関係がはっきり見られた。</w:t>
       </w:r>
     </w:p>
     <w:p>
@@ -458,7 +458,7 @@
           <w:sz w:val="21"/>
           <w:szCs w:val="21"/>
         </w:rPr>
-        <w:t xml:space="preserve">Nash ら(2022)は、英国の診療記録を用いて、小児期の虐待(疑いを含む)が記録された183,897人と、年齢や性別などを合わせた621,699人を比べた。虐待を受けた群では、アトピー性疾患の発症リスクが1.14倍、喘息のリスクが1.42倍であった。この研究は虐待全般を扱っており、加害者が父親かどうかは区別していない。</w:t>
+        <w:t xml:space="preserve">Nash ら(2022)は、イギリスの診療記録を使った研究である。子どものころに虐待を受けた(疑いを含む)と記録された183,897人と、年齢や性別などをそろえた621,699人を比べた。すると、虐待を受けた人は、アトピー性疾患になる割合が1.14倍、喘息になる割合が1.42倍であった。この研究は虐待全般を調べたもので、暴力をふるった人が父親かどうかは分けていない。</w:t>
       </w:r>
       <w:r>
         <w:rPr>
@@ -468,7 +468,7 @@
           <w:highlight w:val="yellow"/>
           <w:highlightCs w:val="yellow"/>
         </w:rPr>
-        <w:t xml:space="preserve">【虐待とDVの違いを、自分の言葉で一文で書く。】</w:t>
+        <w:t xml:space="preserve">【虐待とDVはどう違うのかを、自分の言葉で一文で書く。】</w:t>
       </w:r>
     </w:p>
     <w:p>
@@ -484,22 +484,22 @@
           <w:sz w:val="21"/>
           <w:szCs w:val="21"/>
         </w:rPr>
-        <w:t xml:space="preserve">3.3 女性本人の被害とアトピー</w:t>
-      </w:r>
-    </w:p>
-    <w:p>
-      <w:pPr>
-        <w:spacing w:after="0" w:line="360"/>
-        <w:ind w:firstLine="210"/>
-        <w:jc w:val="both"/>
-      </w:pPr>
-      <w:r>
-        <w:rPr>
-          <w:rFonts w:ascii="Times New Roman" w:eastAsia="MS Mincho" w:hAnsi="Times New Roman"/>
-          <w:sz w:val="21"/>
-          <w:szCs w:val="21"/>
-        </w:rPr>
-        <w:t xml:space="preserve">Nash ら(2023)は、同じく英国の診療記録を使い、DV被害の記録がある女性13,852人と、対照の女性49,036人を比べた。DV被害のある女性は、その後にアトピー性疾患を発症するリスクが1.52倍であった。内訳は、喘息が1.69倍、アトピー性皮膚炎が1.40倍、アレルギー性鼻結膜炎が1.63倍である。この研究の対象は子どもではなく被害を受けた女性本人だが、湿疹を含むアトピー性疾患とDVとの関連を示した点で重要である。</w:t>
+        <w:t xml:space="preserve">3.3 女性本人が受けた暴力とアトピー</w:t>
+      </w:r>
+    </w:p>
+    <w:p>
+      <w:pPr>
+        <w:spacing w:after="0" w:line="360"/>
+        <w:ind w:firstLine="210"/>
+        <w:jc w:val="both"/>
+      </w:pPr>
+      <w:r>
+        <w:rPr>
+          <w:rFonts w:ascii="Times New Roman" w:eastAsia="MS Mincho" w:hAnsi="Times New Roman"/>
+          <w:sz w:val="21"/>
+          <w:szCs w:val="21"/>
+        </w:rPr>
+        <w:t xml:space="preserve">Nash ら(2023)も、イギリスの診療記録を使った研究である。DVを受けたと記録された女性13,852人と、そうでない女性49,036人を比べた。DVを受けた女性は、その後アトピー性疾患になる割合が1.52倍であった。病気ごとに見ると、喘息が1.69倍、アトピー性皮膚炎が1.40倍、アレルギー性鼻結膜炎が1.63倍であった。この研究の対象は子どもではなく、被害を受けた女性本人である。しかし、湿疹も含めてDVとの関係を示した点で大切である。</w:t>
       </w:r>
     </w:p>
     <w:p>
@@ -515,22 +515,22 @@
           <w:sz w:val="21"/>
           <w:szCs w:val="21"/>
         </w:rPr>
-        <w:t xml:space="preserve">3.4 レビューによる全体像</w:t>
-      </w:r>
-    </w:p>
-    <w:p>
-      <w:pPr>
-        <w:spacing w:after="0" w:line="360"/>
-        <w:ind w:firstLine="210"/>
-        <w:jc w:val="both"/>
-      </w:pPr>
-      <w:r>
-        <w:rPr>
-          <w:rFonts w:ascii="Times New Roman" w:eastAsia="MS Mincho" w:hAnsi="Times New Roman"/>
-          <w:sz w:val="21"/>
-          <w:szCs w:val="21"/>
-        </w:rPr>
-        <w:t xml:space="preserve">Han と Celedón(2024)のレビューは、暴力への曝露と喘息に関する近年の研究を整理している。それによれば、母親の生涯のIPVや慢性的な対人トラウマは、子どもの喘息のオッズが29〜82%高いことと関連していた(横断研究3本)。縦断研究でも、母親のIPVと子どもの喘息や反復性の喘鳴との関連が報告されている。一方で、IPVと喘息に関連が見られなかった研究も存在する。また、このレビューは、暴力の種類ごとの寄与を分けて推定できないこと、想起バイアスがあること、交絡因子の扱いが研究ごとに異なることを、解釈上の限界として挙げている。</w:t>
+        <w:t xml:space="preserve">3.4 レビューによる全体の整理</w:t>
+      </w:r>
+    </w:p>
+    <w:p>
+      <w:pPr>
+        <w:spacing w:after="0" w:line="360"/>
+        <w:ind w:firstLine="210"/>
+        <w:jc w:val="both"/>
+      </w:pPr>
+      <w:r>
+        <w:rPr>
+          <w:rFonts w:ascii="Times New Roman" w:eastAsia="MS Mincho" w:hAnsi="Times New Roman"/>
+          <w:sz w:val="21"/>
+          <w:szCs w:val="21"/>
+        </w:rPr>
+        <w:t xml:space="preserve">Han と Celedón(2024)のレビューは、暴力と喘息に関する最近の研究をまとめたものである。それによると、母親が暴力を受けた経験のある子どもは、喘息になる割合が29〜82%高いという研究が3本あった。時間をかけて追いかけた研究でも、母親の被害と子どもの喘息やぜいぜいする呼吸との関係が報告されている。一方で、関係が見られなかった研究もある。また、このレビューは、暴力の種類ごとの影響を分けて調べるのが難しいことや、過去のことを思い出して答える際の間違い、ほかの原因の考え方が研究ごとに違うことを、研究の弱い点として挙げている。</w:t>
       </w:r>
     </w:p>
     <w:p>
@@ -561,57 +561,57 @@
           <w:sz w:val="21"/>
           <w:szCs w:val="21"/>
         </w:rPr>
-        <w:t xml:space="preserve">暴力にさらされることが、なぜ喘息やアレルギーと関連しうるのか。読んだ論文では、主に次の3つの説明が挙げられていた。いずれも仮説であり、確定した経路ではない点に注意が必要である。</w:t>
-      </w:r>
-    </w:p>
-    <w:p>
-      <w:pPr>
-        <w:spacing w:after="0" w:line="360"/>
-        <w:ind w:firstLine="210"/>
-        <w:jc w:val="both"/>
-      </w:pPr>
-      <w:r>
-        <w:rPr>
-          <w:rFonts w:ascii="Times New Roman" w:eastAsia="MS Mincho" w:hAnsi="Times New Roman"/>
-          <w:b/>
-          <w:bCs/>
-          <w:sz w:val="21"/>
-          <w:szCs w:val="21"/>
-        </w:rPr>
-        <w:t xml:space="preserve">(1) ストレス反応系の変化。</w:t>
-      </w:r>
-      <w:r>
-        <w:rPr>
-          <w:rFonts w:ascii="Times New Roman" w:eastAsia="MS Mincho" w:hAnsi="Times New Roman"/>
-          <w:sz w:val="21"/>
-          <w:szCs w:val="21"/>
-        </w:rPr>
-        <w:t xml:space="preserve"> 慢性的なストレスは、体のストレス反応を担うHPA軸(視床下部・下垂体・副腎系)の働きを変えると考えられている。Bair-Merritt ら(2015)では、ストレス課題でコルチゾールが上がりやすい子どもでだけ、母親のIPVと喘息の関連が有意であった。このことは、ストレスへの生理的な反応しやすさが、影響の受けやすさを左右する可能性を示唆する。</w:t>
-      </w:r>
-    </w:p>
-    <w:p>
-      <w:pPr>
-        <w:spacing w:after="0" w:line="360"/>
-        <w:ind w:firstLine="210"/>
-        <w:jc w:val="both"/>
-      </w:pPr>
-      <w:r>
-        <w:rPr>
-          <w:rFonts w:ascii="Times New Roman" w:eastAsia="MS Mincho" w:hAnsi="Times New Roman"/>
-          <w:b/>
-          <w:bCs/>
-          <w:sz w:val="21"/>
-          <w:szCs w:val="21"/>
-        </w:rPr>
-        <w:t xml:space="preserve">(2) 免疫の偏り。</w:t>
-      </w:r>
-      <w:r>
-        <w:rPr>
-          <w:rFonts w:ascii="Times New Roman" w:eastAsia="MS Mincho" w:hAnsi="Times New Roman"/>
-          <w:sz w:val="21"/>
-          <w:szCs w:val="21"/>
-        </w:rPr>
-        <w:t xml:space="preserve"> Nash ら(2023)は、強いストレスにさらされた人では、免疫のバランスがTh1型からTh2型へ傾き、IgE抗体が増えるという先行研究を紹介している。IgEは環境中のアレルゲンに反応するため、この偏りがアトピー性疾患の起こりやすさにつながりうるという説明である。また、慢性的なストレスの蓄積(allostatic load)により、炎症性サイトカインが増えることも指摘されている。ただしこの研究は成人女性を対象としており、子どもにそのまま当てはまるとは限らない。</w:t>
+        <w:t xml:space="preserve">なぜ、暴力にさらされると喘息やアレルギーになりやすくなるのだろうか。読んだ論文には、主に3つの考え方が出ていた。どれもまだ「仮説」、つまり「こうかもしれない」という段階であり、証明されたわけではない。</w:t>
+      </w:r>
+    </w:p>
+    <w:p>
+      <w:pPr>
+        <w:spacing w:after="0" w:line="360"/>
+        <w:ind w:firstLine="210"/>
+        <w:jc w:val="both"/>
+      </w:pPr>
+      <w:r>
+        <w:rPr>
+          <w:rFonts w:ascii="Times New Roman" w:eastAsia="MS Mincho" w:hAnsi="Times New Roman"/>
+          <w:b/>
+          <w:bCs/>
+          <w:sz w:val="21"/>
+          <w:szCs w:val="21"/>
+        </w:rPr>
+        <w:t xml:space="preserve">(1) ストレスに反応する体の仕組みの変化。</w:t>
+      </w:r>
+      <w:r>
+        <w:rPr>
+          <w:rFonts w:ascii="Times New Roman" w:eastAsia="MS Mincho" w:hAnsi="Times New Roman"/>
+          <w:sz w:val="21"/>
+          <w:szCs w:val="21"/>
+        </w:rPr>
+        <w:t xml:space="preserve"> 人の体には、ストレスを受けるとホルモンを出して対応する仕組みがある。強いストレスが長く続くと、この仕組みの働き方が変わると考えられている。Bair-Merritt ら(2015)では、ストレスでホルモンが増えやすい子どもでだけ、母親の被害と喘息の関係がはっきりしていた。つまり、ストレスに体が反応しやすい子どもほど、影響を受けやすいのかもしれない。</w:t>
+      </w:r>
+    </w:p>
+    <w:p>
+      <w:pPr>
+        <w:spacing w:after="0" w:line="360"/>
+        <w:ind w:firstLine="210"/>
+        <w:jc w:val="both"/>
+      </w:pPr>
+      <w:r>
+        <w:rPr>
+          <w:rFonts w:ascii="Times New Roman" w:eastAsia="MS Mincho" w:hAnsi="Times New Roman"/>
+          <w:b/>
+          <w:bCs/>
+          <w:sz w:val="21"/>
+          <w:szCs w:val="21"/>
+        </w:rPr>
+        <w:t xml:space="preserve">(2) 免疫のかたよりの変化。</w:t>
+      </w:r>
+      <w:r>
+        <w:rPr>
+          <w:rFonts w:ascii="Times New Roman" w:eastAsia="MS Mincho" w:hAnsi="Times New Roman"/>
+          <w:sz w:val="21"/>
+          <w:szCs w:val="21"/>
+        </w:rPr>
+        <w:t xml:space="preserve"> 免疫とは、病気から体を守る仕組みのことである。Nash ら(2023)は、強いストレスを受けると、免疫のバランスがアレルギーを起こしやすい方向にかたより、アレルギーに関わる抗体(IgE)が増えるという先行研究を紹介している。この抗体が増えると、ほこりや花粉などに反応しやすくなる。ただし、この研究の対象は大人の女性なので、子どもにそのまま当てはまるとは限らない。</w:t>
       </w:r>
     </w:p>
     <w:p>
@@ -636,7 +636,7 @@
           <w:sz w:val="21"/>
           <w:szCs w:val="21"/>
         </w:rPr>
-        <w:t xml:space="preserve"> Suglia ら(2010)では、住環境の乱れがあると、IPVと喘息の関連がより強く見られた。暴力そのものだけでなく、劣悪な住環境のような他のストレスが重なることで、リスクが高まる可能性がある。</w:t>
+        <w:t xml:space="preserve"> Suglia ら(2010)では、住環境が悪い家庭ほど、暴力と喘息の関係が強く出ていた。暴力だけでなく、住まいの問題など別のストレスが重なることで、リスクが高くなる可能性がある。</w:t>
       </w:r>
       <w:r>
         <w:rPr>
@@ -646,7 +646,7 @@
           <w:highlight w:val="yellow"/>
           <w:highlightCs w:val="yellow"/>
         </w:rPr>
-        <w:t xml:space="preserve">【自分で調べて、他の要因(家庭の経済状況など)を加えてもよい。】</w:t>
+        <w:t xml:space="preserve">【自分で調べて、家庭の経済状況など、ほかの要因を加えてもよい。】</w:t>
       </w:r>
     </w:p>
     <w:p>
@@ -677,122 +677,122 @@
           <w:sz w:val="21"/>
           <w:szCs w:val="21"/>
         </w:rPr>
-        <w:t xml:space="preserve">以上の研究から、母親が受けたIPVと子どもの喘息に関連があるという報告は複数あるといえる。しかし、本レポートの問いに照らすと、次の4つの点が未解決である。</w:t>
-      </w:r>
-    </w:p>
-    <w:p>
-      <w:pPr>
-        <w:spacing w:after="0" w:line="360"/>
-        <w:ind w:firstLine="210"/>
-        <w:jc w:val="both"/>
-      </w:pPr>
-      <w:r>
-        <w:rPr>
-          <w:rFonts w:ascii="Times New Roman" w:eastAsia="MS Mincho" w:hAnsi="Times New Roman"/>
-          <w:b/>
-          <w:bCs/>
-          <w:sz w:val="21"/>
-          <w:szCs w:val="21"/>
-        </w:rPr>
-        <w:t xml:space="preserve">第一に、父親の暴力に限定した研究が見つからなかった。</w:t>
-      </w:r>
-      <w:r>
-        <w:rPr>
-          <w:rFonts w:ascii="Times New Roman" w:eastAsia="MS Mincho" w:hAnsi="Times New Roman"/>
-          <w:sz w:val="21"/>
-          <w:szCs w:val="21"/>
-        </w:rPr>
-        <w:t xml:space="preserve"> Suglia ら(2010)は、子の父親または現在のパートナーからの暴力を尋ねているが、父親だけを取り出して分析してはいない。Han と Celedón(2024)のレビューにも、父親に限った記述は見当たらなかった。Nash ら(2023)は、記録された加害者が男性とは限らないが、DVの加害者の多くは男性であると述べている。したがって、「父親の暴力」と子どもの病気の関連は、現時点では直接には検証されていないと考えるのが妥当である。</w:t>
-      </w:r>
-    </w:p>
-    <w:p>
-      <w:pPr>
-        <w:spacing w:after="0" w:line="360"/>
-        <w:ind w:firstLine="210"/>
-        <w:jc w:val="both"/>
-      </w:pPr>
-      <w:r>
-        <w:rPr>
-          <w:rFonts w:ascii="Times New Roman" w:eastAsia="MS Mincho" w:hAnsi="Times New Roman"/>
-          <w:b/>
-          <w:bCs/>
-          <w:sz w:val="21"/>
-          <w:szCs w:val="21"/>
-        </w:rPr>
-        <w:t xml:space="preserve">第二に、湿疹や食物アレルギーを調べた研究が乏しい。</w:t>
-      </w:r>
-      <w:r>
-        <w:rPr>
-          <w:rFonts w:ascii="Times New Roman" w:eastAsia="MS Mincho" w:hAnsi="Times New Roman"/>
-          <w:sz w:val="21"/>
-          <w:szCs w:val="21"/>
-        </w:rPr>
-        <w:t xml:space="preserve"> 子どもを対象とした研究は、主に喘息に集中していた。アトピー性皮膚炎との関連を示した研究(Nash ら, 2023)は成人女性を対象としており、子どもの湿疹や食物アレルギーについては、今回の範囲では直接の証拠を確認できなかった。</w:t>
-      </w:r>
-    </w:p>
-    <w:p>
-      <w:pPr>
-        <w:spacing w:after="0" w:line="360"/>
-        <w:ind w:firstLine="210"/>
-        <w:jc w:val="both"/>
-      </w:pPr>
-      <w:r>
-        <w:rPr>
-          <w:rFonts w:ascii="Times New Roman" w:eastAsia="MS Mincho" w:hAnsi="Times New Roman"/>
-          <w:b/>
-          <w:bCs/>
-          <w:sz w:val="21"/>
-          <w:szCs w:val="21"/>
-        </w:rPr>
-        <w:t xml:space="preserve">第三に、因果関係は断定できない。</w:t>
-      </w:r>
-      <w:r>
-        <w:rPr>
-          <w:rFonts w:ascii="Times New Roman" w:eastAsia="MS Mincho" w:hAnsi="Times New Roman"/>
-          <w:sz w:val="21"/>
-          <w:szCs w:val="21"/>
-        </w:rPr>
-        <w:t xml:space="preserve"> 読んだ研究は観察研究であり、経済状況や住環境、親の健康状態など、暴力と病気の両方に影響しうる別の要因(交絡)を完全には取り除けない。実際、Han と Celedón(2024)は、交絡の扱いが研究ごとに異なることや、IPVと喘息に関連が見られなかった研究もあることを指摘している。</w:t>
-      </w:r>
-    </w:p>
-    <w:p>
-      <w:pPr>
-        <w:spacing w:after="0" w:line="360"/>
-        <w:ind w:firstLine="210"/>
-        <w:jc w:val="both"/>
-      </w:pPr>
-      <w:r>
-        <w:rPr>
-          <w:rFonts w:ascii="Times New Roman" w:eastAsia="MS Mincho" w:hAnsi="Times New Roman"/>
-          <w:b/>
-          <w:bCs/>
-          <w:sz w:val="21"/>
-          <w:szCs w:val="21"/>
-        </w:rPr>
-        <w:t xml:space="preserve">第四に、測定の精度に限界がある。</w:t>
-      </w:r>
-      <w:r>
-        <w:rPr>
-          <w:rFonts w:ascii="Times New Roman" w:eastAsia="MS Mincho" w:hAnsi="Times New Roman"/>
-          <w:sz w:val="21"/>
-          <w:szCs w:val="21"/>
-        </w:rPr>
-        <w:t xml:space="preserve"> 暴力や病気の情報が、母親の自己申告や診療記録のコードに依存している。記録されない被害や、思い出すときの偏り(想起バイアス)の影響を受ける。</w:t>
-      </w:r>
-    </w:p>
-    <w:p>
-      <w:pPr>
-        <w:spacing w:after="0" w:line="360"/>
-        <w:ind w:firstLine="210"/>
-        <w:jc w:val="both"/>
-      </w:pPr>
-      <w:r>
-        <w:rPr>
-          <w:rFonts w:ascii="Times New Roman" w:eastAsia="MS Mincho" w:hAnsi="Times New Roman"/>
-          <w:sz w:val="21"/>
-          <w:szCs w:val="21"/>
-        </w:rPr>
-        <w:t xml:space="preserve">これらを踏まえると、「DVが子どもの喘息の原因である」と言い切ることはできない。一方で、関連が繰り返し報告されている以上、診察の場で家庭内の暴力の可能性に気づく視点は、子どもの健康を守るうえで意味があるかもしれない。</w:t>
+        <w:t xml:space="preserve">ここまでの研究から、母親が受けた暴力と子どもの喘息に関係があるという報告は、いくつもあると言える。しかし、本レポートの問いに照らすと、まだ分かっていないことが4つある。</w:t>
+      </w:r>
+    </w:p>
+    <w:p>
+      <w:pPr>
+        <w:spacing w:after="0" w:line="360"/>
+        <w:ind w:firstLine="210"/>
+        <w:jc w:val="both"/>
+      </w:pPr>
+      <w:r>
+        <w:rPr>
+          <w:rFonts w:ascii="Times New Roman" w:eastAsia="MS Mincho" w:hAnsi="Times New Roman"/>
+          <w:b/>
+          <w:bCs/>
+          <w:sz w:val="21"/>
+          <w:szCs w:val="21"/>
+        </w:rPr>
+        <w:t xml:space="preserve">1つ目は、父親の暴力だけを調べた研究が見つからなかったことである。</w:t>
+      </w:r>
+      <w:r>
+        <w:rPr>
+          <w:rFonts w:ascii="Times New Roman" w:eastAsia="MS Mincho" w:hAnsi="Times New Roman"/>
+          <w:sz w:val="21"/>
+          <w:szCs w:val="21"/>
+        </w:rPr>
+        <w:t xml:space="preserve"> Suglia ら(2010)は、子どもの父親や今のパートナーからの暴力を尋ねているが、父親だけを取り出して分析してはいない。Han と Celedón(2024)のレビューにも、父親に限った記述は見当たらなかった。Nash ら(2023)は、暴力をふるった人が男性とは限らないが、ほとんどは男性だと述べている。そのため、「父親の暴力」と子どもの病気の関係は、今のところ直接には確かめられていないと考えられる。</w:t>
+      </w:r>
+    </w:p>
+    <w:p>
+      <w:pPr>
+        <w:spacing w:after="0" w:line="360"/>
+        <w:ind w:firstLine="210"/>
+        <w:jc w:val="both"/>
+      </w:pPr>
+      <w:r>
+        <w:rPr>
+          <w:rFonts w:ascii="Times New Roman" w:eastAsia="MS Mincho" w:hAnsi="Times New Roman"/>
+          <w:b/>
+          <w:bCs/>
+          <w:sz w:val="21"/>
+          <w:szCs w:val="21"/>
+        </w:rPr>
+        <w:t xml:space="preserve">2つ目は、湿疹や食物アレルギーを調べた研究が少ないことである。</w:t>
+      </w:r>
+      <w:r>
+        <w:rPr>
+          <w:rFonts w:ascii="Times New Roman" w:eastAsia="MS Mincho" w:hAnsi="Times New Roman"/>
+          <w:sz w:val="21"/>
+          <w:szCs w:val="21"/>
+        </w:rPr>
+        <w:t xml:space="preserve"> 子どもを対象にした研究は、ほとんどが喘息に集中していた。湿疹との関係を示した研究(Nash ら, 2023)は大人の女性が対象であり、子どもの湿疹や食物アレルギーについては、今回読んだ範囲では直接の証拠を確認できなかった。</w:t>
+      </w:r>
+    </w:p>
+    <w:p>
+      <w:pPr>
+        <w:spacing w:after="0" w:line="360"/>
+        <w:ind w:firstLine="210"/>
+        <w:jc w:val="both"/>
+      </w:pPr>
+      <w:r>
+        <w:rPr>
+          <w:rFonts w:ascii="Times New Roman" w:eastAsia="MS Mincho" w:hAnsi="Times New Roman"/>
+          <w:b/>
+          <w:bCs/>
+          <w:sz w:val="21"/>
+          <w:szCs w:val="21"/>
+        </w:rPr>
+        <w:t xml:space="preserve">3つ目は、原因だと断定できないことである。</w:t>
+      </w:r>
+      <w:r>
+        <w:rPr>
+          <w:rFonts w:ascii="Times New Roman" w:eastAsia="MS Mincho" w:hAnsi="Times New Roman"/>
+          <w:sz w:val="21"/>
+          <w:szCs w:val="21"/>
+        </w:rPr>
+        <w:t xml:space="preserve"> 読んだ研究は観察研究なので、家の経済状況や住まい、親の健康状態など、暴力と病気の両方に関わるほかの要因を、完全には取り除けない。実際に、Han と Celedón(2024)は、ほかの要因の扱いが研究ごとに違うことや、関係が見られなかった研究もあることを指摘している。</w:t>
+      </w:r>
+    </w:p>
+    <w:p>
+      <w:pPr>
+        <w:spacing w:after="0" w:line="360"/>
+        <w:ind w:firstLine="210"/>
+        <w:jc w:val="both"/>
+      </w:pPr>
+      <w:r>
+        <w:rPr>
+          <w:rFonts w:ascii="Times New Roman" w:eastAsia="MS Mincho" w:hAnsi="Times New Roman"/>
+          <w:b/>
+          <w:bCs/>
+          <w:sz w:val="21"/>
+          <w:szCs w:val="21"/>
+        </w:rPr>
+        <w:t xml:space="preserve">4つ目は、調べ方に限界があることである。</w:t>
+      </w:r>
+      <w:r>
+        <w:rPr>
+          <w:rFonts w:ascii="Times New Roman" w:eastAsia="MS Mincho" w:hAnsi="Times New Roman"/>
+          <w:sz w:val="21"/>
+          <w:szCs w:val="21"/>
+        </w:rPr>
+        <w:t xml:space="preserve"> 暴力や病気の情報は、母親の自己申告や診療記録に頼っている。記録に残らない被害や、思い出し間違いの影響を受けるおそれがある。</w:t>
+      </w:r>
+    </w:p>
+    <w:p>
+      <w:pPr>
+        <w:spacing w:after="0" w:line="360"/>
+        <w:ind w:firstLine="210"/>
+        <w:jc w:val="both"/>
+      </w:pPr>
+      <w:r>
+        <w:rPr>
+          <w:rFonts w:ascii="Times New Roman" w:eastAsia="MS Mincho" w:hAnsi="Times New Roman"/>
+          <w:sz w:val="21"/>
+          <w:szCs w:val="21"/>
+        </w:rPr>
+        <w:t xml:space="preserve">以上のことから、「DVが子どもの喘息の原因だ」と言い切ることはできない。しかし、関係が何度も報告されている以上、病院で子どもを診るときに、家庭内の暴力の可能性にも気づこうとする姿勢は、子どもの健康を守るために意味があるかもしれない。</w:t>
       </w:r>
       <w:r>
         <w:rPr>
@@ -833,7 +833,7 @@
           <w:sz w:val="21"/>
           <w:szCs w:val="21"/>
         </w:rPr>
-        <w:t xml:space="preserve">本レポートでは、パートナーからの暴力への曝露と、子どもの喘息・アレルギーの関連について、5本の論文を整理した。母親が受けたIPVと子どもの喘息には関連を示す研究が複数あり、その背景には、ストレス反応系の変化や免疫の偏り、生活環境との重なりといった仮説が示されていた。一方で、父親の暴力に限定した研究や、子どもの湿疹・食物アレルギーを扱った研究は乏しく、因果関係も確定していない。今後は、加害者別に分析した縦断研究や、喘息以外のアレルギー疾患を対象とした研究が求められる。</w:t>
+        <w:t xml:space="preserve">本レポートでは、パートナーからの暴力と、子どもの喘息・アレルギーとの関係について、5本の論文を読んで整理した。母親が暴力を受けた家庭の子どもは、喘息になりやすいという研究がいくつかあり、その理由として、ストレスに反応する体の仕組みの変化、免疫のかたより、住まいなどほかのストレスとの重なりが考えられていた。一方で、父親の暴力だけを調べた研究や、子どもの湿疹・食物アレルギーを調べた研究は少なく、原因かどうかもまだ分かっていない。今後は、暴力をふるった人ごとに分けて調べる研究や、喘息以外のアレルギーを調べる研究が必要である。</w:t>
       </w:r>
     </w:p>
     <w:p>

</xml_diff>